<commit_message>
Improve report preview, photo editing and sorting; document roadmap
</commit_message>
<xml_diff>
--- a/workbench/resources/report_template.docx
+++ b/workbench/resources/report_template.docx
@@ -2684,11 +2684,11 @@
     <w:p>
       <w:pPr>
         <w:pStyle w:val="Heading1"/>
+        <w:pageBreakBefore/>
         <w:rPr>
           <w:sz w:val="20"/>
           <w:szCs w:val="20"/>
         </w:rPr>
-        <w:pageBreakBefore/>
       </w:pPr>
       <w:r>
         <w:rPr>
@@ -2713,10 +2713,10 @@
     <w:p>
       <w:pPr>
         <w:pStyle w:val="Heading1"/>
+        <w:pageBreakBefore/>
         <w:rPr>
           <w:szCs w:val="20"/>
         </w:rPr>
-        <w:pageBreakBefore/>
       </w:pPr>
       <w:r>
         <w:rPr>
@@ -2769,9 +2769,9 @@
           </w:tcPr>
           <w:p>
             <w:pPr>
+              <w:keepNext/>
               <w:spacing w:after="0" w:line="240" w:lineRule="auto"/>
               <w:jc w:val="left"/>
-              <w:keepNext/>
             </w:pPr>
             <w:r>
               <w:t xml:space="preserve"/>
@@ -2790,6 +2790,7 @@
           </w:tcPr>
           <w:p>
             <w:pPr>
+              <w:keepNext/>
               <w:spacing w:after="0" w:line="240" w:lineRule="auto"/>
               <w:jc w:val="left"/>
               <w:rPr>
@@ -2797,7 +2798,6 @@
                 <w:bCs/>
                 <w:lang w:val="en-US"/>
               </w:rPr>
-              <w:keepNext/>
             </w:pPr>
             <w:r>
               <w:rPr>
@@ -2821,12 +2821,12 @@
           </w:tcPr>
           <w:p>
             <w:pPr>
+              <w:keepNext/>
               <w:spacing w:after="0" w:line="240" w:lineRule="auto"/>
               <w:jc w:val="left"/>
               <w:rPr>
                 <w:lang w:val="en-US"/>
               </w:rPr>
-              <w:keepNext/>
             </w:pPr>
             <w:r>
               <w:rPr>
@@ -2853,9 +2853,9 @@
           </w:tcPr>
           <w:p>
             <w:pPr>
+              <w:keepNext/>
               <w:spacing w:after="0" w:line="240" w:lineRule="auto"/>
               <w:jc w:val="left"/>
-              <w:keepNext/>
             </w:pPr>
             <w:r>
               <w:t xml:space="preserve"/>
@@ -2875,9 +2875,9 @@
           </w:tcPr>
           <w:p>
             <w:pPr>
+              <w:keepNext/>
               <w:spacing w:after="0" w:line="240" w:lineRule="auto"/>
               <w:jc w:val="left"/>
-              <w:keepNext/>
             </w:pPr>
             <w:r>
               <w:rPr>
@@ -2901,12 +2901,12 @@
           </w:tcPr>
           <w:p>
             <w:pPr>
+              <w:keepNext/>
               <w:spacing w:after="0" w:line="240" w:lineRule="auto"/>
               <w:jc w:val="left"/>
               <w:rPr>
                 <w:lang w:val="en-US"/>
               </w:rPr>
-              <w:keepNext/>
             </w:pPr>
             <w:r>
               <w:t xml:space="preserve"/>
@@ -2930,9 +2930,9 @@
           </w:tcPr>
           <w:p>
             <w:pPr>
+              <w:keepNext/>
               <w:spacing w:after="0" w:line="240" w:lineRule="auto"/>
               <w:jc w:val="left"/>
-              <w:keepNext/>
             </w:pPr>
             <w:r>
               <w:t xml:space="preserve"/>
@@ -2952,9 +2952,9 @@
           </w:tcPr>
           <w:p>
             <w:pPr>
+              <w:keepNext/>
               <w:spacing w:after="0" w:line="240" w:lineRule="auto"/>
               <w:jc w:val="left"/>
-              <w:keepNext/>
             </w:pPr>
             <w:r>
               <w:rPr>
@@ -2978,12 +2978,12 @@
           </w:tcPr>
           <w:p>
             <w:pPr>
+              <w:keepNext/>
               <w:spacing w:after="0" w:line="240" w:lineRule="auto"/>
               <w:jc w:val="left"/>
               <w:rPr>
                 <w:lang w:val="en-US"/>
               </w:rPr>
-              <w:keepNext/>
             </w:pPr>
             <w:r>
               <w:t xml:space="preserve"/>
@@ -3007,9 +3007,9 @@
           </w:tcPr>
           <w:p>
             <w:pPr>
+              <w:keepNext/>
               <w:spacing w:after="0" w:line="240" w:lineRule="auto"/>
               <w:jc w:val="left"/>
-              <w:keepNext/>
             </w:pPr>
             <w:r>
               <w:t xml:space="preserve"/>
@@ -3028,6 +3028,7 @@
           </w:tcPr>
           <w:p>
             <w:pPr>
+              <w:keepNext/>
               <w:spacing w:after="0" w:line="240" w:lineRule="auto"/>
               <w:jc w:val="left"/>
               <w:rPr>
@@ -3035,7 +3036,6 @@
                 <w:bCs/>
                 <w:lang w:val="en-US"/>
               </w:rPr>
-              <w:keepNext/>
             </w:pPr>
             <w:r>
               <w:rPr>
@@ -3059,12 +3059,12 @@
           </w:tcPr>
           <w:p>
             <w:pPr>
+              <w:keepNext/>
               <w:spacing w:after="0" w:line="240" w:lineRule="auto"/>
               <w:jc w:val="left"/>
               <w:rPr>
                 <w:lang w:val="en-US"/>
               </w:rPr>
-              <w:keepNext/>
             </w:pPr>
             <w:r>
               <w:rPr>
@@ -3091,9 +3091,9 @@
           </w:tcPr>
           <w:p>
             <w:pPr>
+              <w:keepNext/>
               <w:spacing w:after="0" w:line="240" w:lineRule="auto"/>
               <w:jc w:val="left"/>
-              <w:keepNext/>
             </w:pPr>
             <w:r>
               <w:t xml:space="preserve"/>
@@ -3113,9 +3113,9 @@
           </w:tcPr>
           <w:p>
             <w:pPr>
+              <w:keepNext/>
               <w:spacing w:after="0" w:line="240" w:lineRule="auto"/>
               <w:jc w:val="left"/>
-              <w:keepNext/>
             </w:pPr>
             <w:r>
               <w:rPr>
@@ -3140,12 +3140,12 @@
           </w:tcPr>
           <w:p>
             <w:pPr>
+              <w:keepNext/>
               <w:spacing w:after="0" w:line="240" w:lineRule="auto"/>
               <w:jc w:val="left"/>
               <w:rPr>
                 <w:lang w:val="en-US"/>
               </w:rPr>
-              <w:keepNext/>
             </w:pPr>
             <w:r>
               <w:rPr>
@@ -3188,11 +3188,11 @@
               <w:bottom w:val="single" w:sz="4" w:space="0" w:color="auto"/>
               <w:right w:val="single" w:sz="4" w:space="0" w:color="auto"/>
             </w:tcBorders>
-            <w:hideMark/>
             <w:tcMar>
               <w:left w:w="0" w:type="dxa"/>
               <w:right w:w="0" w:type="dxa"/>
             </w:tcMar>
+            <w:hideMark/>
           </w:tcPr>
           <w:p>
             <w:pPr>
@@ -3241,11 +3241,11 @@
     <w:p>
       <w:pPr>
         <w:pStyle w:val="Heading1"/>
+        <w:pageBreakBefore/>
         <w:rPr>
           <w:sz w:val="20"/>
           <w:szCs w:val="20"/>
         </w:rPr>
-        <w:pageBreakBefore/>
       </w:pPr>
       <w:r>
         <w:rPr>
@@ -3263,11 +3263,11 @@
     <w:p>
       <w:pPr>
         <w:pStyle w:val="Heading1"/>
+        <w:pageBreakBefore/>
         <w:rPr>
           <w:sz w:val="20"/>
           <w:szCs w:val="20"/>
         </w:rPr>
-        <w:pageBreakBefore/>
       </w:pPr>
       <w:r>
         <w:rPr>
@@ -3285,12 +3285,12 @@
     <w:p>
       <w:pPr>
         <w:pStyle w:val="Heading1"/>
+        <w:pageBreakBefore/>
         <w:rPr>
           <w:sz w:val="20"/>
           <w:szCs w:val="20"/>
           <w:lang w:val="en-US"/>
         </w:rPr>
-        <w:pageBreakBefore/>
       </w:pPr>
       <w:r>
         <w:rPr>

</xml_diff>